<commit_message>
Updated report with discussion
</commit_message>
<xml_diff>
--- a/[2026-GroupID 18] CSC3156 Project Report.docx
+++ b/[2026-GroupID 18] CSC3156 Project Report.docx
@@ -375,6 +375,13 @@
     </w:tbl>
     <w:sdt>
       <w:sdtPr>
+        <w:rPr>
+          <w:rFonts w:asciiTheme="minorHAnsi" w:eastAsiaTheme="minorEastAsia" w:hAnsiTheme="minorHAnsi" w:cstheme="minorBidi"/>
+          <w:color w:val="auto"/>
+          <w:sz w:val="22"/>
+          <w:szCs w:val="22"/>
+          <w:lang w:val="en-SG" w:eastAsia="en-US"/>
+        </w:rPr>
         <w:id w:val="-1357036901"/>
         <w:docPartObj>
           <w:docPartGallery w:val="Table of Contents"/>
@@ -383,13 +390,8 @@
       </w:sdtPr>
       <w:sdtEndPr>
         <w:rPr>
-          <w:rFonts w:asciiTheme="minorHAnsi" w:eastAsiaTheme="minorEastAsia" w:hAnsiTheme="minorHAnsi" w:cstheme="minorBidi"/>
           <w:b/>
           <w:bCs/>
-          <w:color w:val="auto"/>
-          <w:sz w:val="22"/>
-          <w:szCs w:val="22"/>
-          <w:lang w:val="en-SG" w:eastAsia="en-US"/>
         </w:rPr>
       </w:sdtEndPr>
       <w:sdtContent>
@@ -451,7 +453,7 @@
             </w:rPr>
             <w:fldChar w:fldCharType="separate"/>
           </w:r>
-          <w:hyperlink w:anchor="_Toc226086376" w:history="1">
+          <w:hyperlink w:anchor="_Toc226143697" w:history="1">
             <w:r>
               <w:rPr>
                 <w:rStyle w:val="Hyperlink"/>
@@ -500,7 +502,7 @@
                 <w:noProof/>
                 <w:webHidden/>
               </w:rPr>
-              <w:instrText xml:space="preserve"> PAGEREF _Toc226086376 \h </w:instrText>
+              <w:instrText xml:space="preserve"> PAGEREF _Toc226143697 \h </w:instrText>
             </w:r>
             <w:r>
               <w:rPr>
@@ -551,7 +553,7 @@
               <w14:ligatures w14:val="standardContextual"/>
             </w:rPr>
           </w:pPr>
-          <w:hyperlink w:anchor="_Toc226086377" w:history="1">
+          <w:hyperlink w:anchor="_Toc226143698" w:history="1">
             <w:r>
               <w:rPr>
                 <w:rStyle w:val="Hyperlink"/>
@@ -600,7 +602,7 @@
                 <w:noProof/>
                 <w:webHidden/>
               </w:rPr>
-              <w:instrText xml:space="preserve"> PAGEREF _Toc226086377 \h </w:instrText>
+              <w:instrText xml:space="preserve"> PAGEREF _Toc226143698 \h </w:instrText>
             </w:r>
             <w:r>
               <w:rPr>
@@ -648,7 +650,7 @@
               <w14:ligatures w14:val="standardContextual"/>
             </w:rPr>
           </w:pPr>
-          <w:hyperlink w:anchor="_Toc226086378" w:history="1">
+          <w:hyperlink w:anchor="_Toc226143699" w:history="1">
             <w:r>
               <w:rPr>
                 <w:rStyle w:val="Hyperlink"/>
@@ -694,7 +696,7 @@
                 <w:noProof/>
                 <w:webHidden/>
               </w:rPr>
-              <w:instrText xml:space="preserve"> PAGEREF _Toc226086378 \h </w:instrText>
+              <w:instrText xml:space="preserve"> PAGEREF _Toc226143699 \h </w:instrText>
             </w:r>
             <w:r>
               <w:rPr>
@@ -742,7 +744,7 @@
               <w14:ligatures w14:val="standardContextual"/>
             </w:rPr>
           </w:pPr>
-          <w:hyperlink w:anchor="_Toc226086379" w:history="1">
+          <w:hyperlink w:anchor="_Toc226143700" w:history="1">
             <w:r>
               <w:rPr>
                 <w:rStyle w:val="Hyperlink"/>
@@ -788,7 +790,7 @@
                 <w:noProof/>
                 <w:webHidden/>
               </w:rPr>
-              <w:instrText xml:space="preserve"> PAGEREF _Toc226086379 \h </w:instrText>
+              <w:instrText xml:space="preserve"> PAGEREF _Toc226143700 \h </w:instrText>
             </w:r>
             <w:r>
               <w:rPr>
@@ -836,7 +838,7 @@
               <w14:ligatures w14:val="standardContextual"/>
             </w:rPr>
           </w:pPr>
-          <w:hyperlink w:anchor="_Toc226086380" w:history="1">
+          <w:hyperlink w:anchor="_Toc226143701" w:history="1">
             <w:r>
               <w:rPr>
                 <w:rStyle w:val="Hyperlink"/>
@@ -882,7 +884,7 @@
                 <w:noProof/>
                 <w:webHidden/>
               </w:rPr>
-              <w:instrText xml:space="preserve"> PAGEREF _Toc226086380 \h </w:instrText>
+              <w:instrText xml:space="preserve"> PAGEREF _Toc226143701 \h </w:instrText>
             </w:r>
             <w:r>
               <w:rPr>
@@ -930,7 +932,7 @@
               <w14:ligatures w14:val="standardContextual"/>
             </w:rPr>
           </w:pPr>
-          <w:hyperlink w:anchor="_Toc226086381" w:history="1">
+          <w:hyperlink w:anchor="_Toc226143702" w:history="1">
             <w:r>
               <w:rPr>
                 <w:rStyle w:val="Hyperlink"/>
@@ -976,7 +978,7 @@
                 <w:noProof/>
                 <w:webHidden/>
               </w:rPr>
-              <w:instrText xml:space="preserve"> PAGEREF _Toc226086381 \h </w:instrText>
+              <w:instrText xml:space="preserve"> PAGEREF _Toc226143702 \h </w:instrText>
             </w:r>
             <w:r>
               <w:rPr>
@@ -1027,7 +1029,7 @@
               <w14:ligatures w14:val="standardContextual"/>
             </w:rPr>
           </w:pPr>
-          <w:hyperlink w:anchor="_Toc226086382" w:history="1">
+          <w:hyperlink w:anchor="_Toc226143703" w:history="1">
             <w:r>
               <w:rPr>
                 <w:rStyle w:val="Hyperlink"/>
@@ -1076,7 +1078,7 @@
                 <w:noProof/>
                 <w:webHidden/>
               </w:rPr>
-              <w:instrText xml:space="preserve"> PAGEREF _Toc226086382 \h </w:instrText>
+              <w:instrText xml:space="preserve"> PAGEREF _Toc226143703 \h </w:instrText>
             </w:r>
             <w:r>
               <w:rPr>
@@ -1097,6 +1099,382 @@
                 <w:webHidden/>
               </w:rPr>
               <w:t>8</w:t>
+            </w:r>
+            <w:r>
+              <w:rPr>
+                <w:noProof/>
+                <w:webHidden/>
+              </w:rPr>
+              <w:fldChar w:fldCharType="end"/>
+            </w:r>
+          </w:hyperlink>
+        </w:p>
+        <w:p>
+          <w:pPr>
+            <w:pStyle w:val="TOC5"/>
+            <w:tabs>
+              <w:tab w:val="left" w:pos="1540"/>
+              <w:tab w:val="right" w:leader="dot" w:pos="9016"/>
+            </w:tabs>
+            <w:rPr>
+              <w:rFonts w:cstheme="minorBidi"/>
+              <w:noProof/>
+              <w:kern w:val="2"/>
+              <w:sz w:val="24"/>
+              <w:szCs w:val="24"/>
+              <w:lang w:val="en-GB" w:eastAsia="zh-CN"/>
+              <w14:ligatures w14:val="standardContextual"/>
+            </w:rPr>
+          </w:pPr>
+          <w:hyperlink w:anchor="_Toc226143704" w:history="1">
+            <w:r>
+              <w:rPr>
+                <w:rStyle w:val="Hyperlink"/>
+                <w:noProof/>
+              </w:rPr>
+              <w:t>3.1</w:t>
+            </w:r>
+            <w:r>
+              <w:rPr>
+                <w:rFonts w:cstheme="minorBidi"/>
+                <w:noProof/>
+                <w:kern w:val="2"/>
+                <w:sz w:val="24"/>
+                <w:szCs w:val="24"/>
+                <w:lang w:val="en-GB" w:eastAsia="zh-CN"/>
+                <w14:ligatures w14:val="standardContextual"/>
+              </w:rPr>
+              <w:tab/>
+            </w:r>
+            <w:r>
+              <w:rPr>
+                <w:rStyle w:val="Hyperlink"/>
+                <w:noProof/>
+              </w:rPr>
+              <w:t>Scalability</w:t>
+            </w:r>
+            <w:r>
+              <w:rPr>
+                <w:noProof/>
+                <w:webHidden/>
+              </w:rPr>
+              <w:tab/>
+            </w:r>
+            <w:r>
+              <w:rPr>
+                <w:noProof/>
+                <w:webHidden/>
+              </w:rPr>
+              <w:fldChar w:fldCharType="begin"/>
+            </w:r>
+            <w:r>
+              <w:rPr>
+                <w:noProof/>
+                <w:webHidden/>
+              </w:rPr>
+              <w:instrText xml:space="preserve"> PAGEREF _Toc226143704 \h </w:instrText>
+            </w:r>
+            <w:r>
+              <w:rPr>
+                <w:noProof/>
+                <w:webHidden/>
+              </w:rPr>
+            </w:r>
+            <w:r>
+              <w:rPr>
+                <w:noProof/>
+                <w:webHidden/>
+              </w:rPr>
+              <w:fldChar w:fldCharType="separate"/>
+            </w:r>
+            <w:r>
+              <w:rPr>
+                <w:noProof/>
+                <w:webHidden/>
+              </w:rPr>
+              <w:t>8</w:t>
+            </w:r>
+            <w:r>
+              <w:rPr>
+                <w:noProof/>
+                <w:webHidden/>
+              </w:rPr>
+              <w:fldChar w:fldCharType="end"/>
+            </w:r>
+          </w:hyperlink>
+        </w:p>
+        <w:p>
+          <w:pPr>
+            <w:pStyle w:val="TOC5"/>
+            <w:tabs>
+              <w:tab w:val="left" w:pos="1540"/>
+              <w:tab w:val="right" w:leader="dot" w:pos="9016"/>
+            </w:tabs>
+            <w:rPr>
+              <w:rFonts w:cstheme="minorBidi"/>
+              <w:noProof/>
+              <w:kern w:val="2"/>
+              <w:sz w:val="24"/>
+              <w:szCs w:val="24"/>
+              <w:lang w:val="en-GB" w:eastAsia="zh-CN"/>
+              <w14:ligatures w14:val="standardContextual"/>
+            </w:rPr>
+          </w:pPr>
+          <w:hyperlink w:anchor="_Toc226143705" w:history="1">
+            <w:r>
+              <w:rPr>
+                <w:rStyle w:val="Hyperlink"/>
+                <w:noProof/>
+              </w:rPr>
+              <w:t>3.2</w:t>
+            </w:r>
+            <w:r>
+              <w:rPr>
+                <w:rFonts w:cstheme="minorBidi"/>
+                <w:noProof/>
+                <w:kern w:val="2"/>
+                <w:sz w:val="24"/>
+                <w:szCs w:val="24"/>
+                <w:lang w:val="en-GB" w:eastAsia="zh-CN"/>
+                <w14:ligatures w14:val="standardContextual"/>
+              </w:rPr>
+              <w:tab/>
+            </w:r>
+            <w:r>
+              <w:rPr>
+                <w:rStyle w:val="Hyperlink"/>
+                <w:noProof/>
+              </w:rPr>
+              <w:t>Reliability</w:t>
+            </w:r>
+            <w:r>
+              <w:rPr>
+                <w:noProof/>
+                <w:webHidden/>
+              </w:rPr>
+              <w:tab/>
+            </w:r>
+            <w:r>
+              <w:rPr>
+                <w:noProof/>
+                <w:webHidden/>
+              </w:rPr>
+              <w:fldChar w:fldCharType="begin"/>
+            </w:r>
+            <w:r>
+              <w:rPr>
+                <w:noProof/>
+                <w:webHidden/>
+              </w:rPr>
+              <w:instrText xml:space="preserve"> PAGEREF _Toc226143705 \h </w:instrText>
+            </w:r>
+            <w:r>
+              <w:rPr>
+                <w:noProof/>
+                <w:webHidden/>
+              </w:rPr>
+            </w:r>
+            <w:r>
+              <w:rPr>
+                <w:noProof/>
+                <w:webHidden/>
+              </w:rPr>
+              <w:fldChar w:fldCharType="separate"/>
+            </w:r>
+            <w:r>
+              <w:rPr>
+                <w:noProof/>
+                <w:webHidden/>
+              </w:rPr>
+              <w:t>8</w:t>
+            </w:r>
+            <w:r>
+              <w:rPr>
+                <w:noProof/>
+                <w:webHidden/>
+              </w:rPr>
+              <w:fldChar w:fldCharType="end"/>
+            </w:r>
+          </w:hyperlink>
+        </w:p>
+        <w:p>
+          <w:pPr>
+            <w:pStyle w:val="TOC5"/>
+            <w:tabs>
+              <w:tab w:val="left" w:pos="1540"/>
+              <w:tab w:val="right" w:leader="dot" w:pos="9016"/>
+            </w:tabs>
+            <w:rPr>
+              <w:rFonts w:cstheme="minorBidi"/>
+              <w:noProof/>
+              <w:kern w:val="2"/>
+              <w:sz w:val="24"/>
+              <w:szCs w:val="24"/>
+              <w:lang w:val="en-GB" w:eastAsia="zh-CN"/>
+              <w14:ligatures w14:val="standardContextual"/>
+            </w:rPr>
+          </w:pPr>
+          <w:hyperlink w:anchor="_Toc226143706" w:history="1">
+            <w:r>
+              <w:rPr>
+                <w:rStyle w:val="Hyperlink"/>
+                <w:noProof/>
+              </w:rPr>
+              <w:t>3.3</w:t>
+            </w:r>
+            <w:r>
+              <w:rPr>
+                <w:rFonts w:cstheme="minorBidi"/>
+                <w:noProof/>
+                <w:kern w:val="2"/>
+                <w:sz w:val="24"/>
+                <w:szCs w:val="24"/>
+                <w:lang w:val="en-GB" w:eastAsia="zh-CN"/>
+                <w14:ligatures w14:val="standardContextual"/>
+              </w:rPr>
+              <w:tab/>
+            </w:r>
+            <w:r>
+              <w:rPr>
+                <w:rStyle w:val="Hyperlink"/>
+                <w:noProof/>
+              </w:rPr>
+              <w:t>Security</w:t>
+            </w:r>
+            <w:r>
+              <w:rPr>
+                <w:noProof/>
+                <w:webHidden/>
+              </w:rPr>
+              <w:tab/>
+            </w:r>
+            <w:r>
+              <w:rPr>
+                <w:noProof/>
+                <w:webHidden/>
+              </w:rPr>
+              <w:fldChar w:fldCharType="begin"/>
+            </w:r>
+            <w:r>
+              <w:rPr>
+                <w:noProof/>
+                <w:webHidden/>
+              </w:rPr>
+              <w:instrText xml:space="preserve"> PAGEREF _Toc226143706 \h </w:instrText>
+            </w:r>
+            <w:r>
+              <w:rPr>
+                <w:noProof/>
+                <w:webHidden/>
+              </w:rPr>
+            </w:r>
+            <w:r>
+              <w:rPr>
+                <w:noProof/>
+                <w:webHidden/>
+              </w:rPr>
+              <w:fldChar w:fldCharType="separate"/>
+            </w:r>
+            <w:r>
+              <w:rPr>
+                <w:noProof/>
+                <w:webHidden/>
+              </w:rPr>
+              <w:t>9</w:t>
+            </w:r>
+            <w:r>
+              <w:rPr>
+                <w:noProof/>
+                <w:webHidden/>
+              </w:rPr>
+              <w:fldChar w:fldCharType="end"/>
+            </w:r>
+          </w:hyperlink>
+        </w:p>
+        <w:p>
+          <w:pPr>
+            <w:pStyle w:val="TOC5"/>
+            <w:tabs>
+              <w:tab w:val="left" w:pos="1540"/>
+              <w:tab w:val="right" w:leader="dot" w:pos="9016"/>
+            </w:tabs>
+            <w:rPr>
+              <w:rFonts w:cstheme="minorBidi"/>
+              <w:noProof/>
+              <w:kern w:val="2"/>
+              <w:sz w:val="24"/>
+              <w:szCs w:val="24"/>
+              <w:lang w:val="en-GB" w:eastAsia="zh-CN"/>
+              <w14:ligatures w14:val="standardContextual"/>
+            </w:rPr>
+          </w:pPr>
+          <w:hyperlink w:anchor="_Toc226143707" w:history="1">
+            <w:r>
+              <w:rPr>
+                <w:rStyle w:val="Hyperlink"/>
+                <w:noProof/>
+              </w:rPr>
+              <w:t>3.4</w:t>
+            </w:r>
+            <w:r>
+              <w:rPr>
+                <w:rFonts w:cstheme="minorBidi"/>
+                <w:noProof/>
+                <w:kern w:val="2"/>
+                <w:sz w:val="24"/>
+                <w:szCs w:val="24"/>
+                <w:lang w:val="en-GB" w:eastAsia="zh-CN"/>
+                <w14:ligatures w14:val="standardContextual"/>
+              </w:rPr>
+              <w:tab/>
+            </w:r>
+            <w:r>
+              <w:rPr>
+                <w:rStyle w:val="Hyperlink"/>
+                <w:noProof/>
+              </w:rPr>
+              <w:t>Limitations and Future Improvements</w:t>
+            </w:r>
+            <w:r>
+              <w:rPr>
+                <w:noProof/>
+                <w:webHidden/>
+              </w:rPr>
+              <w:tab/>
+            </w:r>
+            <w:r>
+              <w:rPr>
+                <w:noProof/>
+                <w:webHidden/>
+              </w:rPr>
+              <w:fldChar w:fldCharType="begin"/>
+            </w:r>
+            <w:r>
+              <w:rPr>
+                <w:noProof/>
+                <w:webHidden/>
+              </w:rPr>
+              <w:instrText xml:space="preserve"> PAGEREF _Toc226143707 \h </w:instrText>
+            </w:r>
+            <w:r>
+              <w:rPr>
+                <w:noProof/>
+                <w:webHidden/>
+              </w:rPr>
+            </w:r>
+            <w:r>
+              <w:rPr>
+                <w:noProof/>
+                <w:webHidden/>
+              </w:rPr>
+              <w:fldChar w:fldCharType="separate"/>
+            </w:r>
+            <w:r>
+              <w:rPr>
+                <w:noProof/>
+                <w:webHidden/>
+              </w:rPr>
+              <w:t>9</w:t>
             </w:r>
             <w:r>
               <w:rPr>
@@ -1127,7 +1505,7 @@
               <w14:ligatures w14:val="standardContextual"/>
             </w:rPr>
           </w:pPr>
-          <w:hyperlink w:anchor="_Toc226086383" w:history="1">
+          <w:hyperlink w:anchor="_Toc226143708" w:history="1">
             <w:r>
               <w:rPr>
                 <w:rStyle w:val="Hyperlink"/>
@@ -1176,7 +1554,7 @@
                 <w:noProof/>
                 <w:webHidden/>
               </w:rPr>
-              <w:instrText xml:space="preserve"> PAGEREF _Toc226086383 \h </w:instrText>
+              <w:instrText xml:space="preserve"> PAGEREF _Toc226143708 \h </w:instrText>
             </w:r>
             <w:r>
               <w:rPr>
@@ -1196,7 +1574,7 @@
                 <w:noProof/>
                 <w:webHidden/>
               </w:rPr>
-              <w:t>8</w:t>
+              <w:t>11</w:t>
             </w:r>
             <w:r>
               <w:rPr>
@@ -1227,7 +1605,7 @@
               <w14:ligatures w14:val="standardContextual"/>
             </w:rPr>
           </w:pPr>
-          <w:hyperlink w:anchor="_Toc226086384" w:history="1">
+          <w:hyperlink w:anchor="_Toc226143709" w:history="1">
             <w:r>
               <w:rPr>
                 <w:rStyle w:val="Hyperlink"/>
@@ -1276,7 +1654,7 @@
                 <w:noProof/>
                 <w:webHidden/>
               </w:rPr>
-              <w:instrText xml:space="preserve"> PAGEREF _Toc226086384 \h </w:instrText>
+              <w:instrText xml:space="preserve"> PAGEREF _Toc226143709 \h </w:instrText>
             </w:r>
             <w:r>
               <w:rPr>
@@ -1296,7 +1674,7 @@
                 <w:noProof/>
                 <w:webHidden/>
               </w:rPr>
-              <w:t>8</w:t>
+              <w:t>12</w:t>
             </w:r>
             <w:r>
               <w:rPr>
@@ -1326,7 +1704,7 @@
               <w14:ligatures w14:val="standardContextual"/>
             </w:rPr>
           </w:pPr>
-          <w:hyperlink w:anchor="_Toc226086385" w:history="1">
+          <w:hyperlink w:anchor="_Toc226143710" w:history="1">
             <w:r>
               <w:rPr>
                 <w:rStyle w:val="Hyperlink"/>
@@ -1353,7 +1731,7 @@
                 <w:noProof/>
                 <w:webHidden/>
               </w:rPr>
-              <w:instrText xml:space="preserve"> PAGEREF _Toc226086385 \h </w:instrText>
+              <w:instrText xml:space="preserve"> PAGEREF _Toc226143710 \h </w:instrText>
             </w:r>
             <w:r>
               <w:rPr>
@@ -1373,7 +1751,7 @@
                 <w:noProof/>
                 <w:webHidden/>
               </w:rPr>
-              <w:t>10</w:t>
+              <w:t>13</w:t>
             </w:r>
             <w:r>
               <w:rPr>
@@ -1403,7 +1781,7 @@
               <w14:ligatures w14:val="standardContextual"/>
             </w:rPr>
           </w:pPr>
-          <w:hyperlink w:anchor="_Toc226086386" w:history="1">
+          <w:hyperlink w:anchor="_Toc226143711" w:history="1">
             <w:r>
               <w:rPr>
                 <w:rStyle w:val="Hyperlink"/>
@@ -1430,7 +1808,7 @@
                 <w:noProof/>
                 <w:webHidden/>
               </w:rPr>
-              <w:instrText xml:space="preserve"> PAGEREF _Toc226086386 \h </w:instrText>
+              <w:instrText xml:space="preserve"> PAGEREF _Toc226143711 \h </w:instrText>
             </w:r>
             <w:r>
               <w:rPr>
@@ -1450,7 +1828,7 @@
                 <w:noProof/>
                 <w:webHidden/>
               </w:rPr>
-              <w:t>10</w:t>
+              <w:t>13</w:t>
             </w:r>
             <w:r>
               <w:rPr>
@@ -1501,7 +1879,7 @@
         </w:numPr>
         <w:spacing w:line="276" w:lineRule="auto"/>
       </w:pPr>
-      <w:bookmarkStart w:id="0" w:name="_Toc226086376"/>
+      <w:bookmarkStart w:id="0" w:name="_Toc226143697"/>
       <w:r>
         <w:lastRenderedPageBreak/>
         <w:t>Introduction</w:t>
@@ -1966,7 +2344,7 @@
         </w:numPr>
         <w:spacing w:line="276" w:lineRule="auto"/>
       </w:pPr>
-      <w:bookmarkStart w:id="1" w:name="_Toc226086377"/>
+      <w:bookmarkStart w:id="1" w:name="_Toc226143698"/>
       <w:r>
         <w:lastRenderedPageBreak/>
         <w:t xml:space="preserve">Architecture Design </w:t>
@@ -1987,7 +2365,7 @@
           <w:numId w:val="1"/>
         </w:numPr>
       </w:pPr>
-      <w:bookmarkStart w:id="2" w:name="_Toc226086378"/>
+      <w:bookmarkStart w:id="2" w:name="_Toc226143699"/>
       <w:r>
         <w:t>System Architecture</w:t>
       </w:r>
@@ -2005,6 +2383,9 @@
         <w:spacing w:line="276" w:lineRule="auto"/>
       </w:pPr>
       <w:r>
+        <w:rPr>
+          <w:noProof/>
+        </w:rPr>
         <w:drawing>
           <wp:inline distT="0" distB="0" distL="0" distR="0" wp14:anchorId="309F116A" wp14:editId="1A8C5A8F">
             <wp:extent cx="5731510" cy="2863850"/>
@@ -2363,7 +2744,7 @@
           <w:numId w:val="1"/>
         </w:numPr>
       </w:pPr>
-      <w:bookmarkStart w:id="3" w:name="_Toc226086379"/>
+      <w:bookmarkStart w:id="3" w:name="_Toc226143700"/>
       <w:r>
         <w:t>Functional Components</w:t>
       </w:r>
@@ -2703,7 +3084,7 @@
           <w:numId w:val="1"/>
         </w:numPr>
       </w:pPr>
-      <w:bookmarkStart w:id="4" w:name="_Toc226086380"/>
+      <w:bookmarkStart w:id="4" w:name="_Toc226143701"/>
       <w:r>
         <w:t>Workflow Scenarios</w:t>
       </w:r>
@@ -3160,7 +3541,7 @@
           <w:numId w:val="1"/>
         </w:numPr>
       </w:pPr>
-      <w:bookmarkStart w:id="5" w:name="_Toc226086381"/>
+      <w:bookmarkStart w:id="5" w:name="_Toc226143702"/>
       <w:r>
         <w:t>Deployment</w:t>
       </w:r>
@@ -3550,7 +3931,7 @@
         </w:numPr>
         <w:spacing w:line="276" w:lineRule="auto"/>
       </w:pPr>
-      <w:bookmarkStart w:id="6" w:name="_Toc226086382"/>
+      <w:bookmarkStart w:id="6" w:name="_Toc226143703"/>
       <w:r>
         <w:lastRenderedPageBreak/>
         <w:t>Discussions</w:t>
@@ -3569,98 +3950,799 @@
         <w:spacing w:line="276" w:lineRule="auto"/>
       </w:pPr>
       <w:r>
-        <w:t xml:space="preserve">In this section, </w:t>
-      </w:r>
-      <w:r>
-        <w:t>you</w:t>
-      </w:r>
-      <w:r>
-        <w:t xml:space="preserve"> </w:t>
-      </w:r>
-      <w:r>
-        <w:t>shall describe the</w:t>
-      </w:r>
-      <w:r>
-        <w:t xml:space="preserve"> system functionality and highlight how the system meets some of the requirements related to the following</w:t>
-      </w:r>
-    </w:p>
-    <w:p>
-      <w:pPr>
-        <w:pStyle w:val="BodyText"/>
-        <w:spacing w:line="276" w:lineRule="auto"/>
-      </w:pPr>
-    </w:p>
-    <w:p>
-      <w:pPr>
-        <w:pStyle w:val="BodyText"/>
+        <w:t>This section evaluates the system based on key cloud computing requirements, including scalability, reliability, and security. It also discusses current limitations and potential areas for future improvement.</w:t>
+      </w:r>
+    </w:p>
+    <w:p>
+      <w:pPr>
+        <w:pStyle w:val="BodyText"/>
+        <w:spacing w:line="276" w:lineRule="auto"/>
+      </w:pPr>
+    </w:p>
+    <w:p>
+      <w:pPr>
+        <w:pStyle w:val="Heading5"/>
         <w:numPr>
-          <w:ilvl w:val="0"/>
-          <w:numId w:val="2"/>
+          <w:ilvl w:val="1"/>
+          <w:numId w:val="1"/>
         </w:numPr>
-        <w:spacing w:line="276" w:lineRule="auto"/>
-      </w:pPr>
+      </w:pPr>
+      <w:bookmarkStart w:id="7" w:name="_Toc226143704"/>
       <w:r>
         <w:t>Scalability</w:t>
       </w:r>
-    </w:p>
-    <w:p>
-      <w:pPr>
-        <w:pStyle w:val="BodyText"/>
+      <w:bookmarkEnd w:id="7"/>
+    </w:p>
+    <w:p>
+      <w:pPr>
+        <w:pStyle w:val="BodyText"/>
+        <w:spacing w:line="276" w:lineRule="auto"/>
+      </w:pPr>
+    </w:p>
+    <w:p>
+      <w:pPr>
+        <w:pStyle w:val="BodyText"/>
+        <w:spacing w:line="276" w:lineRule="auto"/>
+        <w:rPr>
+          <w:lang w:val="en-GB"/>
+        </w:rPr>
+      </w:pPr>
+      <w:r>
+        <w:rPr>
+          <w:lang w:val="en-GB"/>
+        </w:rPr>
+        <w:t xml:space="preserve">The system is designed to be highly scalable by leveraging both </w:t>
+      </w:r>
+      <w:r>
+        <w:rPr>
+          <w:b/>
+          <w:bCs/>
+          <w:lang w:val="en-GB"/>
+        </w:rPr>
+        <w:t>serverless services</w:t>
+      </w:r>
+      <w:r>
+        <w:rPr>
+          <w:lang w:val="en-GB"/>
+        </w:rPr>
+        <w:t xml:space="preserve"> and </w:t>
+      </w:r>
+      <w:r>
+        <w:rPr>
+          <w:b/>
+          <w:bCs/>
+          <w:lang w:val="en-GB"/>
+        </w:rPr>
+        <w:t>cloud-based infrastructure</w:t>
+      </w:r>
+      <w:r>
+        <w:rPr>
+          <w:lang w:val="en-GB"/>
+        </w:rPr>
+        <w:t>.</w:t>
+      </w:r>
+    </w:p>
+    <w:p>
+      <w:pPr>
+        <w:pStyle w:val="BodyText"/>
+        <w:spacing w:line="276" w:lineRule="auto"/>
+        <w:rPr>
+          <w:lang w:val="en-GB"/>
+        </w:rPr>
+      </w:pPr>
+    </w:p>
+    <w:p>
+      <w:pPr>
+        <w:pStyle w:val="BodyText"/>
+        <w:spacing w:line="276" w:lineRule="auto"/>
+        <w:rPr>
+          <w:lang w:val="en-GB"/>
+        </w:rPr>
+      </w:pPr>
+      <w:r>
+        <w:rPr>
+          <w:lang w:val="en-GB"/>
+        </w:rPr>
+        <w:t xml:space="preserve">On the frontend, the application is hosted on </w:t>
+      </w:r>
+      <w:r>
+        <w:rPr>
+          <w:b/>
+          <w:bCs/>
+          <w:lang w:val="en-GB"/>
+        </w:rPr>
+        <w:t>EC2 instances behind an Application Load Balancer (ALB)</w:t>
+      </w:r>
+      <w:r>
+        <w:rPr>
+          <w:lang w:val="en-GB"/>
+        </w:rPr>
+        <w:t>. This allows incoming traffic to be distributed across multiple instances, enabling the system to handle concurrent users efficiently. The architecture can be extended with auto-scaling groups to dynamically adjust the number of instances based on demand.</w:t>
+      </w:r>
+    </w:p>
+    <w:p>
+      <w:pPr>
+        <w:pStyle w:val="BodyText"/>
+        <w:spacing w:line="276" w:lineRule="auto"/>
+        <w:rPr>
+          <w:lang w:val="en-GB"/>
+        </w:rPr>
+      </w:pPr>
+    </w:p>
+    <w:p>
+      <w:pPr>
+        <w:pStyle w:val="BodyText"/>
+        <w:spacing w:line="276" w:lineRule="auto"/>
+        <w:rPr>
+          <w:lang w:val="en-GB"/>
+        </w:rPr>
+      </w:pPr>
+      <w:r>
+        <w:rPr>
+          <w:lang w:val="en-GB"/>
+        </w:rPr>
+        <w:t xml:space="preserve">On the backend, scalability is achieved through </w:t>
+      </w:r>
+      <w:r>
+        <w:rPr>
+          <w:b/>
+          <w:bCs/>
+          <w:lang w:val="en-GB"/>
+        </w:rPr>
+        <w:t>AWS Lambda and Amazon SQS</w:t>
+      </w:r>
+      <w:r>
+        <w:rPr>
+          <w:lang w:val="en-GB"/>
+        </w:rPr>
+        <w:t>. When jobs are submitted, they are placed into the SQS queue, which acts as a buffer that decouples job submission from processing. As the number of queued jobs increases, AWS automatically scales the number of Lambda executions to process them in parallel.</w:t>
+      </w:r>
+    </w:p>
+    <w:p>
+      <w:pPr>
+        <w:pStyle w:val="BodyText"/>
+        <w:spacing w:line="276" w:lineRule="auto"/>
+        <w:rPr>
+          <w:lang w:val="en-GB"/>
+        </w:rPr>
+      </w:pPr>
+    </w:p>
+    <w:p>
+      <w:pPr>
+        <w:pStyle w:val="BodyText"/>
+        <w:spacing w:line="276" w:lineRule="auto"/>
+        <w:rPr>
+          <w:lang w:val="en-GB"/>
+        </w:rPr>
+      </w:pPr>
+      <w:r>
+        <w:rPr>
+          <w:lang w:val="en-GB"/>
+        </w:rPr>
+        <w:t xml:space="preserve">It is important to note that Lambda functions are </w:t>
+      </w:r>
+      <w:r>
+        <w:rPr>
+          <w:b/>
+          <w:bCs/>
+          <w:lang w:val="en-GB"/>
+        </w:rPr>
+        <w:t>isolated execution environments rather than threads</w:t>
+      </w:r>
+      <w:r>
+        <w:rPr>
+          <w:lang w:val="en-GB"/>
+        </w:rPr>
+        <w:t xml:space="preserve">, meaning multiple executions can run independently and concurrently. Even a single job submission may result in multiple Lambda invocations due to SQS-triggered scaling </w:t>
+      </w:r>
+      <w:proofErr w:type="spellStart"/>
+      <w:r>
+        <w:rPr>
+          <w:lang w:val="en-GB"/>
+        </w:rPr>
+        <w:t>behavior</w:t>
+      </w:r>
+      <w:proofErr w:type="spellEnd"/>
+      <w:r>
+        <w:rPr>
+          <w:lang w:val="en-GB"/>
+        </w:rPr>
+        <w:t>. This design ensures that the system can handle varying workloads efficiently without manual resource management.</w:t>
+      </w:r>
+    </w:p>
+    <w:p>
+      <w:pPr>
+        <w:pStyle w:val="BodyText"/>
+        <w:spacing w:line="276" w:lineRule="auto"/>
+        <w:rPr>
+          <w:lang w:val="en-GB"/>
+        </w:rPr>
+      </w:pPr>
+    </w:p>
+    <w:p>
+      <w:pPr>
+        <w:pStyle w:val="BodyText"/>
+        <w:spacing w:line="276" w:lineRule="auto"/>
+        <w:rPr>
+          <w:lang w:val="en-GB"/>
+        </w:rPr>
+      </w:pPr>
+      <w:r>
+        <w:rPr>
+          <w:lang w:val="en-GB"/>
+        </w:rPr>
+        <w:t>Overall, the system demonstrates horizontal scalability at both the application and processing layers, making it suitable for handling bursty and unpredictable workloads.</w:t>
+      </w:r>
+    </w:p>
+    <w:p>
+      <w:pPr>
+        <w:pStyle w:val="BodyText"/>
+        <w:spacing w:line="276" w:lineRule="auto"/>
+      </w:pPr>
+    </w:p>
+    <w:p>
+      <w:pPr>
+        <w:pStyle w:val="Heading5"/>
         <w:numPr>
-          <w:ilvl w:val="0"/>
-          <w:numId w:val="2"/>
+          <w:ilvl w:val="1"/>
+          <w:numId w:val="1"/>
         </w:numPr>
-        <w:spacing w:line="276" w:lineRule="auto"/>
-      </w:pPr>
-      <w:r>
-        <w:t xml:space="preserve">Reliability </w:t>
-      </w:r>
-    </w:p>
-    <w:p>
-      <w:pPr>
-        <w:pStyle w:val="BodyText"/>
+      </w:pPr>
+      <w:bookmarkStart w:id="8" w:name="_Toc226143705"/>
+      <w:r>
+        <w:t>Reliability</w:t>
+      </w:r>
+      <w:bookmarkEnd w:id="8"/>
+    </w:p>
+    <w:p>
+      <w:pPr>
+        <w:pStyle w:val="BodyText"/>
+        <w:spacing w:line="276" w:lineRule="auto"/>
+      </w:pPr>
+    </w:p>
+    <w:p>
+      <w:pPr>
+        <w:pStyle w:val="BodyText"/>
+        <w:spacing w:line="276" w:lineRule="auto"/>
+        <w:rPr>
+          <w:lang w:val="en-GB"/>
+        </w:rPr>
+      </w:pPr>
+      <w:r>
+        <w:rPr>
+          <w:lang w:val="en-GB"/>
+        </w:rPr>
+        <w:t xml:space="preserve">Reliability is achieved </w:t>
+      </w:r>
+      <w:r>
+        <w:rPr>
+          <w:lang w:val="en-GB"/>
+        </w:rPr>
+        <w:t>with</w:t>
+      </w:r>
+      <w:r>
+        <w:rPr>
+          <w:lang w:val="en-GB"/>
+        </w:rPr>
+        <w:t xml:space="preserve"> managed AWS services and asynchronous processing patterns.</w:t>
+      </w:r>
+    </w:p>
+    <w:p>
+      <w:pPr>
+        <w:pStyle w:val="BodyText"/>
+        <w:spacing w:line="276" w:lineRule="auto"/>
+        <w:rPr>
+          <w:lang w:val="en-GB"/>
+        </w:rPr>
+      </w:pPr>
+      <w:r>
+        <w:rPr>
+          <w:lang w:val="en-GB"/>
+        </w:rPr>
+        <w:t xml:space="preserve">The use of </w:t>
+      </w:r>
+      <w:r>
+        <w:rPr>
+          <w:b/>
+          <w:bCs/>
+          <w:lang w:val="en-GB"/>
+        </w:rPr>
+        <w:t>Amazon SQS</w:t>
+      </w:r>
+      <w:r>
+        <w:rPr>
+          <w:lang w:val="en-GB"/>
+        </w:rPr>
+        <w:t xml:space="preserve"> ensures that job messages are durably stored and processed independently of user requests. SQS provides </w:t>
+      </w:r>
+      <w:r>
+        <w:rPr>
+          <w:b/>
+          <w:bCs/>
+          <w:lang w:val="en-GB"/>
+        </w:rPr>
+        <w:t>at-least-once delivery semantics</w:t>
+      </w:r>
+      <w:r>
+        <w:rPr>
+          <w:lang w:val="en-GB"/>
+        </w:rPr>
+        <w:t>, meaning that messages may occasionally be delivered more than once. As a result, the system is designed to tolerate duplicate processing, reflecting real-world distributed system reliability practices.</w:t>
+      </w:r>
+    </w:p>
+    <w:p>
+      <w:pPr>
+        <w:pStyle w:val="BodyText"/>
+        <w:spacing w:line="276" w:lineRule="auto"/>
+        <w:rPr>
+          <w:lang w:val="en-GB"/>
+        </w:rPr>
+      </w:pPr>
+    </w:p>
+    <w:p>
+      <w:pPr>
+        <w:pStyle w:val="BodyText"/>
+        <w:spacing w:line="276" w:lineRule="auto"/>
+        <w:rPr>
+          <w:lang w:val="en-GB"/>
+        </w:rPr>
+      </w:pPr>
+      <w:r>
+        <w:rPr>
+          <w:lang w:val="en-GB"/>
+        </w:rPr>
+        <w:t>The backend processing is handled by Lambda functions, which automatically retry failed executions. This improves fault tolerance by ensuring that transient failures do not result in permanent job loss. Additionally, DynamoDB serves as a persistent storage layer for job status and results, ensuring that system state is preserved even if individual components fail.</w:t>
+      </w:r>
+    </w:p>
+    <w:p>
+      <w:pPr>
+        <w:pStyle w:val="BodyText"/>
+        <w:spacing w:line="276" w:lineRule="auto"/>
+        <w:rPr>
+          <w:lang w:val="en-GB"/>
+        </w:rPr>
+      </w:pPr>
+    </w:p>
+    <w:p>
+      <w:pPr>
+        <w:pStyle w:val="BodyText"/>
+        <w:spacing w:line="276" w:lineRule="auto"/>
+        <w:rPr>
+          <w:lang w:val="en-GB"/>
+        </w:rPr>
+      </w:pPr>
+      <w:r>
+        <w:rPr>
+          <w:lang w:val="en-GB"/>
+        </w:rPr>
+        <w:t xml:space="preserve">The decoupled architecture also enhances reliability. Since job submission, processing, </w:t>
+      </w:r>
+      <w:r>
+        <w:rPr>
+          <w:lang w:val="en-GB"/>
+        </w:rPr>
+        <w:lastRenderedPageBreak/>
+        <w:t>and retrieval are handled by separate components, a failure in one part of the system does not necessarily impact the others. For example, even if a worker fails temporarily, jobs remain safely stored in the queue until they are successfully processed.</w:t>
+      </w:r>
+    </w:p>
+    <w:p>
+      <w:pPr>
+        <w:pStyle w:val="BodyText"/>
+        <w:spacing w:line="276" w:lineRule="auto"/>
+      </w:pPr>
+    </w:p>
+    <w:p>
+      <w:pPr>
+        <w:pStyle w:val="Heading5"/>
         <w:numPr>
-          <w:ilvl w:val="0"/>
-          <w:numId w:val="2"/>
+          <w:ilvl w:val="1"/>
+          <w:numId w:val="1"/>
         </w:numPr>
-        <w:spacing w:line="276" w:lineRule="auto"/>
-      </w:pPr>
+      </w:pPr>
+      <w:bookmarkStart w:id="9" w:name="_Toc226143706"/>
       <w:r>
         <w:t>Security</w:t>
       </w:r>
-    </w:p>
-    <w:p>
-      <w:pPr>
-        <w:pStyle w:val="BodyText"/>
-        <w:spacing w:line="276" w:lineRule="auto"/>
-      </w:pPr>
-    </w:p>
-    <w:p>
-      <w:pPr>
-        <w:pStyle w:val="BodyText"/>
-        <w:spacing w:line="276" w:lineRule="auto"/>
-      </w:pPr>
-      <w:r>
-        <w:t>You can also share the limitations of the current design and any areas that need improvement in the future.</w:t>
-      </w:r>
-    </w:p>
-    <w:p>
-      <w:pPr>
-        <w:pStyle w:val="BodyText"/>
-        <w:spacing w:line="276" w:lineRule="auto"/>
-      </w:pPr>
-    </w:p>
-    <w:p>
-      <w:pPr>
-        <w:pStyle w:val="BodyText"/>
-        <w:spacing w:line="276" w:lineRule="auto"/>
-      </w:pPr>
-    </w:p>
-    <w:p>
-      <w:pPr>
-        <w:pStyle w:val="BodyText"/>
-        <w:spacing w:line="276" w:lineRule="auto"/>
-      </w:pPr>
+      <w:bookmarkEnd w:id="9"/>
+    </w:p>
+    <w:p>
+      <w:pPr>
+        <w:pStyle w:val="BodyText"/>
+        <w:spacing w:line="276" w:lineRule="auto"/>
+      </w:pPr>
+    </w:p>
+    <w:p>
+      <w:pPr>
+        <w:pStyle w:val="BodyText"/>
+        <w:spacing w:line="276" w:lineRule="auto"/>
+        <w:rPr>
+          <w:lang w:val="en-GB"/>
+        </w:rPr>
+      </w:pPr>
+      <w:r>
+        <w:rPr>
+          <w:lang w:val="en-GB"/>
+        </w:rPr>
+        <w:t>The system incorporates basic security measures appropriate for its current prototype scope.</w:t>
+      </w:r>
+    </w:p>
+    <w:p>
+      <w:pPr>
+        <w:pStyle w:val="BodyText"/>
+        <w:spacing w:line="276" w:lineRule="auto"/>
+        <w:rPr>
+          <w:lang w:val="en-GB"/>
+        </w:rPr>
+      </w:pPr>
+    </w:p>
+    <w:p>
+      <w:pPr>
+        <w:pStyle w:val="BodyText"/>
+        <w:spacing w:line="276" w:lineRule="auto"/>
+        <w:rPr>
+          <w:lang w:val="en-GB"/>
+        </w:rPr>
+      </w:pPr>
+      <w:r>
+        <w:rPr>
+          <w:lang w:val="en-GB"/>
+        </w:rPr>
+        <w:t xml:space="preserve">API access is centralized through Amazon API Gateway, which serves as the </w:t>
+      </w:r>
+      <w:r>
+        <w:rPr>
+          <w:lang w:val="en-GB"/>
+        </w:rPr>
+        <w:t>single-entry</w:t>
+      </w:r>
+      <w:r>
+        <w:rPr>
+          <w:lang w:val="en-GB"/>
+        </w:rPr>
+        <w:t xml:space="preserve"> point for client requests. This helps reduce direct exposure of backend services and provides a structured interface for submitting jobs and retrieving results. In future iterations, API Gateway can be further enhanced with request validation, authentication, authorization, and rate limiting to improve protection against misuse and excessive traffic.</w:t>
+      </w:r>
+    </w:p>
+    <w:p>
+      <w:pPr>
+        <w:pStyle w:val="BodyText"/>
+        <w:spacing w:line="276" w:lineRule="auto"/>
+        <w:rPr>
+          <w:lang w:val="en-GB"/>
+        </w:rPr>
+      </w:pPr>
+    </w:p>
+    <w:p>
+      <w:pPr>
+        <w:pStyle w:val="BodyText"/>
+        <w:spacing w:line="276" w:lineRule="auto"/>
+        <w:rPr>
+          <w:lang w:val="en-GB"/>
+        </w:rPr>
+      </w:pPr>
+      <w:r>
+        <w:rPr>
+          <w:lang w:val="en-GB"/>
+        </w:rPr>
+        <w:t xml:space="preserve">On the backend, the system uses managed AWS services such as Lambda, SQS, and DynamoDB. By relying on these managed services, the project benefits from AWS’s built-in infrastructure security, service isolation, and operational controls. In the AWS Academy environment, access permissions were handled through the preconfigured </w:t>
+      </w:r>
+      <w:proofErr w:type="spellStart"/>
+      <w:r>
+        <w:rPr>
+          <w:lang w:val="en-GB"/>
+        </w:rPr>
+        <w:t>LabRole</w:t>
+      </w:r>
+      <w:proofErr w:type="spellEnd"/>
+      <w:r>
+        <w:rPr>
+          <w:lang w:val="en-GB"/>
+        </w:rPr>
+        <w:t>, which allowed the components to interact with the required services.</w:t>
+      </w:r>
+    </w:p>
+    <w:p>
+      <w:pPr>
+        <w:pStyle w:val="BodyText"/>
+        <w:spacing w:line="276" w:lineRule="auto"/>
+        <w:rPr>
+          <w:lang w:val="en-GB"/>
+        </w:rPr>
+      </w:pPr>
+    </w:p>
+    <w:p>
+      <w:pPr>
+        <w:pStyle w:val="BodyText"/>
+        <w:spacing w:line="276" w:lineRule="auto"/>
+        <w:rPr>
+          <w:lang w:val="en-GB"/>
+        </w:rPr>
+      </w:pPr>
+      <w:r>
+        <w:rPr>
+          <w:lang w:val="en-GB"/>
+        </w:rPr>
+        <w:t>From an application perspective, the system does not currently provide a fully isolated execution sandbox for untrusted user code. Instead, job processing is limited to the logic implemented within the worker Lambda function. This reduces complexity for the prototype, but also means the platform is not yet suitable for securely executing arbitrary user-submitted programs.</w:t>
+      </w:r>
+    </w:p>
+    <w:p>
+      <w:pPr>
+        <w:pStyle w:val="BodyText"/>
+        <w:spacing w:line="276" w:lineRule="auto"/>
+        <w:rPr>
+          <w:lang w:val="en-GB"/>
+        </w:rPr>
+      </w:pPr>
+    </w:p>
+    <w:p>
+      <w:pPr>
+        <w:pStyle w:val="BodyText"/>
+        <w:spacing w:line="276" w:lineRule="auto"/>
+        <w:rPr>
+          <w:lang w:val="en-GB"/>
+        </w:rPr>
+      </w:pPr>
+      <w:r>
+        <w:rPr>
+          <w:lang w:val="en-GB"/>
+        </w:rPr>
+        <w:t>To improve security in a more advanced version of the project, stronger controls could be added, such as user authentication, per-user access control, stricter API validation, and isolated execution environments using container-based services like AWS Fargate. These enhancements would make the system more suitable for handling untrusted workloads in a real-world deployment.</w:t>
+      </w:r>
+    </w:p>
+    <w:p>
+      <w:pPr>
+        <w:pStyle w:val="BodyText"/>
+        <w:spacing w:line="276" w:lineRule="auto"/>
+      </w:pPr>
+    </w:p>
+    <w:p>
+      <w:pPr>
+        <w:pStyle w:val="Heading5"/>
+        <w:numPr>
+          <w:ilvl w:val="1"/>
+          <w:numId w:val="1"/>
+        </w:numPr>
+      </w:pPr>
+      <w:bookmarkStart w:id="10" w:name="_Toc226143707"/>
+      <w:r>
+        <w:t>Limitations and Future Improvements</w:t>
+      </w:r>
+      <w:bookmarkEnd w:id="10"/>
+    </w:p>
+    <w:p>
+      <w:pPr>
+        <w:pStyle w:val="BodyText"/>
+        <w:spacing w:line="276" w:lineRule="auto"/>
+      </w:pPr>
+    </w:p>
+    <w:p>
+      <w:pPr>
+        <w:pStyle w:val="BodyText"/>
+        <w:spacing w:line="276" w:lineRule="auto"/>
+        <w:rPr>
+          <w:lang w:val="en-GB"/>
+        </w:rPr>
+      </w:pPr>
+      <w:r>
+        <w:rPr>
+          <w:lang w:val="en-GB"/>
+        </w:rPr>
+        <w:t>Despite its strengths, the current system has several limitations.</w:t>
+      </w:r>
+    </w:p>
+    <w:p>
+      <w:pPr>
+        <w:pStyle w:val="BodyText"/>
+        <w:spacing w:line="276" w:lineRule="auto"/>
+        <w:rPr>
+          <w:lang w:val="en-GB"/>
+        </w:rPr>
+      </w:pPr>
+    </w:p>
+    <w:p>
+      <w:pPr>
+        <w:pStyle w:val="BodyText"/>
+        <w:spacing w:line="276" w:lineRule="auto"/>
+        <w:rPr>
+          <w:lang w:val="en-GB"/>
+        </w:rPr>
+      </w:pPr>
+      <w:r>
+        <w:rPr>
+          <w:lang w:val="en-GB"/>
+        </w:rPr>
+        <w:t xml:space="preserve">First, due to the </w:t>
+      </w:r>
+      <w:r>
+        <w:rPr>
+          <w:b/>
+          <w:bCs/>
+          <w:lang w:val="en-GB"/>
+        </w:rPr>
+        <w:t>at-least-once delivery model of SQS</w:t>
+      </w:r>
+      <w:r>
+        <w:rPr>
+          <w:lang w:val="en-GB"/>
+        </w:rPr>
+        <w:t xml:space="preserve">, jobs may be processed multiple times. While the system tolerates this </w:t>
+      </w:r>
+      <w:proofErr w:type="spellStart"/>
+      <w:r>
+        <w:rPr>
+          <w:lang w:val="en-GB"/>
+        </w:rPr>
+        <w:t>behavior</w:t>
+      </w:r>
+      <w:proofErr w:type="spellEnd"/>
+      <w:r>
+        <w:rPr>
+          <w:lang w:val="en-GB"/>
+        </w:rPr>
+        <w:t>, it does not currently implement full idempotency mechanisms to prevent duplicate execution effects. Future improvements could include job deduplication or idempotent processing logic.</w:t>
+      </w:r>
+    </w:p>
+    <w:p>
+      <w:pPr>
+        <w:pStyle w:val="BodyText"/>
+        <w:spacing w:line="276" w:lineRule="auto"/>
+        <w:rPr>
+          <w:lang w:val="en-GB"/>
+        </w:rPr>
+      </w:pPr>
+    </w:p>
+    <w:p>
+      <w:pPr>
+        <w:pStyle w:val="BodyText"/>
+        <w:spacing w:line="276" w:lineRule="auto"/>
+        <w:rPr>
+          <w:lang w:val="en-GB"/>
+        </w:rPr>
+      </w:pPr>
+      <w:r>
+        <w:rPr>
+          <w:lang w:val="en-GB"/>
+        </w:rPr>
+        <w:t xml:space="preserve">Second, the job execution environment is limited in functionality and security. While basic Python execution is supported, it is restricted for safety reasons and does not provide full sandboxing. A more robust solution would involve running jobs in </w:t>
+      </w:r>
+      <w:r>
+        <w:rPr>
+          <w:b/>
+          <w:bCs/>
+          <w:lang w:val="en-GB"/>
+        </w:rPr>
+        <w:t>containerized environments (e.g., ECS or Fargate)</w:t>
+      </w:r>
+      <w:r>
+        <w:rPr>
+          <w:lang w:val="en-GB"/>
+        </w:rPr>
+        <w:t xml:space="preserve"> to safely support multiple programming languages and more complex workloads.</w:t>
+      </w:r>
+    </w:p>
+    <w:p>
+      <w:pPr>
+        <w:pStyle w:val="BodyText"/>
+        <w:spacing w:line="276" w:lineRule="auto"/>
+        <w:rPr>
+          <w:lang w:val="en-GB"/>
+        </w:rPr>
+      </w:pPr>
+    </w:p>
+    <w:p>
+      <w:pPr>
+        <w:pStyle w:val="BodyText"/>
+        <w:spacing w:line="276" w:lineRule="auto"/>
+        <w:rPr>
+          <w:lang w:val="en-GB"/>
+        </w:rPr>
+      </w:pPr>
+      <w:r>
+        <w:rPr>
+          <w:lang w:val="en-GB"/>
+        </w:rPr>
+        <w:t xml:space="preserve">Third, the system currently relies on </w:t>
+      </w:r>
+      <w:r>
+        <w:rPr>
+          <w:b/>
+          <w:bCs/>
+          <w:lang w:val="en-GB"/>
+        </w:rPr>
+        <w:t>polling</w:t>
+      </w:r>
+      <w:r>
+        <w:rPr>
+          <w:lang w:val="en-GB"/>
+        </w:rPr>
+        <w:t xml:space="preserve"> for job status updates. This can lead to unnecessary API calls and increased latency in reflecting real-time changes. Future enhancements could include WebSocket-based communication for real-time updates.</w:t>
+      </w:r>
+    </w:p>
+    <w:p>
+      <w:pPr>
+        <w:pStyle w:val="BodyText"/>
+        <w:spacing w:line="276" w:lineRule="auto"/>
+        <w:rPr>
+          <w:lang w:val="en-GB"/>
+        </w:rPr>
+      </w:pPr>
+      <w:r>
+        <w:rPr>
+          <w:lang w:val="en-GB"/>
+        </w:rPr>
+        <w:t xml:space="preserve">Additionally, the system does not yet include user authentication or authorization mechanisms. Integrating services such as </w:t>
+      </w:r>
+      <w:r>
+        <w:rPr>
+          <w:b/>
+          <w:bCs/>
+          <w:lang w:val="en-GB"/>
+        </w:rPr>
+        <w:t>AWS Cognito</w:t>
+      </w:r>
+      <w:r>
+        <w:rPr>
+          <w:lang w:val="en-GB"/>
+        </w:rPr>
+        <w:t xml:space="preserve"> would enable user-specific job management and improve overall system security.</w:t>
+      </w:r>
+    </w:p>
+    <w:p>
+      <w:pPr>
+        <w:pStyle w:val="BodyText"/>
+        <w:spacing w:line="276" w:lineRule="auto"/>
+        <w:rPr>
+          <w:lang w:val="en-GB"/>
+        </w:rPr>
+      </w:pPr>
+    </w:p>
+    <w:p>
+      <w:pPr>
+        <w:pStyle w:val="BodyText"/>
+        <w:spacing w:line="276" w:lineRule="auto"/>
+        <w:rPr>
+          <w:lang w:val="en-GB"/>
+        </w:rPr>
+      </w:pPr>
+      <w:r>
+        <w:rPr>
+          <w:lang w:val="en-GB"/>
+        </w:rPr>
+        <w:t xml:space="preserve">Finally, while the frontend is deployed on EC2 with load balancing, further improvements such as </w:t>
+      </w:r>
+      <w:r>
+        <w:rPr>
+          <w:b/>
+          <w:bCs/>
+          <w:lang w:val="en-GB"/>
+        </w:rPr>
+        <w:t>auto-scaling groups</w:t>
+      </w:r>
+      <w:r>
+        <w:rPr>
+          <w:lang w:val="en-GB"/>
+        </w:rPr>
+        <w:t xml:space="preserve"> and </w:t>
+      </w:r>
+      <w:r>
+        <w:rPr>
+          <w:b/>
+          <w:bCs/>
+          <w:lang w:val="en-GB"/>
+        </w:rPr>
+        <w:t>content delivery networks (CDN)</w:t>
+      </w:r>
+      <w:r>
+        <w:rPr>
+          <w:lang w:val="en-GB"/>
+        </w:rPr>
+        <w:t xml:space="preserve"> could enhance performance and scalability under high traffic conditions</w:t>
+      </w:r>
+      <w:r>
+        <w:rPr>
+          <w:lang w:val="en-GB"/>
+        </w:rPr>
+        <w:t>.</w:t>
+      </w:r>
     </w:p>
     <w:p>
       <w:pPr>
@@ -3674,7 +4756,6 @@
           <w:szCs w:val="26"/>
         </w:rPr>
       </w:pPr>
-      <w:bookmarkStart w:id="7" w:name="_Toc226086383"/>
       <w:r>
         <w:br w:type="page"/>
       </w:r>
@@ -3688,6 +4769,7 @@
         </w:numPr>
         <w:spacing w:line="276" w:lineRule="auto"/>
       </w:pPr>
+      <w:bookmarkStart w:id="11" w:name="_Toc226143708"/>
       <w:r>
         <w:lastRenderedPageBreak/>
         <w:t xml:space="preserve">Reflection </w:t>
@@ -3695,7 +4777,7 @@
       <w:r>
         <w:t>and takeaways</w:t>
       </w:r>
-      <w:bookmarkEnd w:id="7"/>
+      <w:bookmarkEnd w:id="11"/>
     </w:p>
     <w:p>
       <w:pPr>
@@ -3742,7 +4824,6 @@
           <w:szCs w:val="26"/>
         </w:rPr>
       </w:pPr>
-      <w:bookmarkStart w:id="8" w:name="_Toc226086384"/>
       <w:r>
         <w:br w:type="page"/>
       </w:r>
@@ -3756,6 +4837,7 @@
         </w:numPr>
         <w:spacing w:line="276" w:lineRule="auto"/>
       </w:pPr>
+      <w:bookmarkStart w:id="12" w:name="_Toc226143709"/>
       <w:r>
         <w:lastRenderedPageBreak/>
         <w:t xml:space="preserve">Contribution </w:t>
@@ -3766,7 +4848,7 @@
       <w:r>
         <w:t xml:space="preserve"> team members</w:t>
       </w:r>
-      <w:bookmarkEnd w:id="8"/>
+      <w:bookmarkEnd w:id="12"/>
     </w:p>
     <w:p>
       <w:pPr>
@@ -4797,11 +5879,11 @@
         <w:pStyle w:val="Heading1"/>
         <w:spacing w:line="276" w:lineRule="auto"/>
       </w:pPr>
-      <w:bookmarkStart w:id="9" w:name="_Toc226086385"/>
+      <w:bookmarkStart w:id="13" w:name="_Toc226143710"/>
       <w:r>
         <w:t>Reference</w:t>
       </w:r>
-      <w:bookmarkEnd w:id="9"/>
+      <w:bookmarkEnd w:id="13"/>
       <w:r>
         <w:br/>
       </w:r>
@@ -4835,7 +5917,7 @@
           <w:lang w:val="en-SG" w:eastAsia="zh-SG"/>
         </w:rPr>
       </w:pPr>
-      <w:bookmarkStart w:id="10" w:name="_Ref117845988"/>
+      <w:bookmarkStart w:id="14" w:name="_Ref117845988"/>
       <w:r>
         <w:rPr>
           <w:rFonts w:ascii="Arial" w:eastAsia="Verdana" w:hAnsi="Arial" w:cs="Arial"/>
@@ -4848,7 +5930,7 @@
         </w:rPr>
         <w:t>G. Eason, B. Noble, and I. N. Sneddon, “On certain integrals of Lipschitz-Hankel type involving products of Bessel functions,” Phil. Trans. Roy. Soc. London, vol. A247, pp. 529–551, April 1955. (references)</w:t>
       </w:r>
-      <w:bookmarkEnd w:id="10"/>
+      <w:bookmarkEnd w:id="14"/>
     </w:p>
     <w:p>
       <w:pPr>
@@ -4905,14 +5987,14 @@
         <w:pStyle w:val="Heading1"/>
         <w:spacing w:line="276" w:lineRule="auto"/>
       </w:pPr>
-      <w:bookmarkStart w:id="11" w:name="_Toc226086386"/>
+      <w:bookmarkStart w:id="15" w:name="_Toc226143711"/>
       <w:r>
         <w:t>Appendix</w:t>
       </w:r>
       <w:r>
         <w:t xml:space="preserve"> I</w:t>
       </w:r>
-      <w:bookmarkEnd w:id="11"/>
+      <w:bookmarkEnd w:id="15"/>
     </w:p>
     <w:p>
       <w:pPr>
@@ -5238,7 +6320,7 @@
         <w:noProof/>
         <w:sz w:val="16"/>
       </w:rPr>
-      <w:t>11</w:t>
+      <w:t>13</w:t>
     </w:r>
     <w:r>
       <w:rPr>

</xml_diff>

<commit_message>
Added Images to Report
</commit_message>
<xml_diff>
--- a/[2026-GroupID 18] CSC3156 Project Report.docx
+++ b/[2026-GroupID 18] CSC3156 Project Report.docx
@@ -2902,75 +2902,82 @@
         <w:pStyle w:val="BodyText"/>
         <w:spacing w:line="276" w:lineRule="auto"/>
         <w:rPr>
-          <w:lang w:val="en-GB"/>
-        </w:rPr>
-      </w:pPr>
-      <w:r>
-        <w:rPr>
           <w:b/>
           <w:bCs/>
           <w:lang w:val="en-GB"/>
         </w:rPr>
-        <w:t>Amazon API Gateway</w:t>
-      </w:r>
-    </w:p>
-    <w:p>
-      <w:pPr>
-        <w:pStyle w:val="BodyText"/>
-        <w:spacing w:line="276" w:lineRule="auto"/>
-        <w:rPr>
-          <w:lang w:val="en-GB"/>
-        </w:rPr>
-      </w:pPr>
-      <w:r>
-        <w:rPr>
-          <w:lang w:val="en-GB"/>
-        </w:rPr>
-        <w:t>Acts as the entry point for all client requests. It handles routing of HTTP requests to the appropriate Lambda functions and manages API endpoints.</w:t>
-      </w:r>
-    </w:p>
-    <w:p>
-      <w:pPr>
-        <w:pStyle w:val="BodyText"/>
-        <w:spacing w:line="276" w:lineRule="auto"/>
-        <w:jc w:val="left"/>
-        <w:rPr>
-          <w:lang w:val="en-GB"/>
-        </w:rPr>
-      </w:pPr>
-    </w:p>
-    <w:p>
-      <w:pPr>
-        <w:pStyle w:val="BodyText"/>
-        <w:spacing w:line="276" w:lineRule="auto"/>
-        <w:rPr>
-          <w:lang w:val="en-GB"/>
-        </w:rPr>
-      </w:pPr>
-      <w:proofErr w:type="spellStart"/>
+      </w:pPr>
       <w:r>
         <w:rPr>
           <w:b/>
           <w:bCs/>
           <w:lang w:val="en-GB"/>
         </w:rPr>
-        <w:t>submitJobLambda</w:t>
-      </w:r>
-      <w:proofErr w:type="spellEnd"/>
-    </w:p>
-    <w:p>
-      <w:pPr>
-        <w:pStyle w:val="BodyText"/>
-        <w:spacing w:line="276" w:lineRule="auto"/>
-        <w:rPr>
-          <w:lang w:val="en-GB"/>
-        </w:rPr>
-      </w:pPr>
-      <w:r>
-        <w:rPr>
-          <w:lang w:val="en-GB"/>
-        </w:rPr>
-        <w:t>Responsible for validating incoming job requests, generating job IDs, storing initial job data, and sending messages to the SQS queue.</w:t>
+        <w:t>Amazon API Gateway</w:t>
+      </w:r>
+    </w:p>
+    <w:p>
+      <w:pPr>
+        <w:pStyle w:val="BodyText"/>
+        <w:spacing w:line="276" w:lineRule="auto"/>
+        <w:rPr>
+          <w:lang w:val="en-GB"/>
+        </w:rPr>
+      </w:pPr>
+      <w:r>
+        <w:rPr>
+          <w:lang w:val="en-GB"/>
+        </w:rPr>
+        <w:drawing>
+          <wp:inline distT="0" distB="0" distL="0" distR="0" wp14:anchorId="2048FEF6" wp14:editId="0B1D593B">
+            <wp:extent cx="5731510" cy="1329690"/>
+            <wp:effectExtent l="0" t="0" r="2540" b="3810"/>
+            <wp:docPr id="2084606220" name="Picture 1"/>
+            <wp:cNvGraphicFramePr>
+              <a:graphicFrameLocks xmlns:a="http://schemas.openxmlformats.org/drawingml/2006/main" noChangeAspect="1"/>
+            </wp:cNvGraphicFramePr>
+            <a:graphic xmlns:a="http://schemas.openxmlformats.org/drawingml/2006/main">
+              <a:graphicData uri="http://schemas.openxmlformats.org/drawingml/2006/picture">
+                <pic:pic xmlns:pic="http://schemas.openxmlformats.org/drawingml/2006/picture">
+                  <pic:nvPicPr>
+                    <pic:cNvPr id="2084606220" name=""/>
+                    <pic:cNvPicPr/>
+                  </pic:nvPicPr>
+                  <pic:blipFill>
+                    <a:blip r:embed="rId9"/>
+                    <a:stretch>
+                      <a:fillRect/>
+                    </a:stretch>
+                  </pic:blipFill>
+                  <pic:spPr>
+                    <a:xfrm>
+                      <a:off x="0" y="0"/>
+                      <a:ext cx="5731510" cy="1329690"/>
+                    </a:xfrm>
+                    <a:prstGeom prst="rect">
+                      <a:avLst/>
+                    </a:prstGeom>
+                  </pic:spPr>
+                </pic:pic>
+              </a:graphicData>
+            </a:graphic>
+          </wp:inline>
+        </w:drawing>
+      </w:r>
+    </w:p>
+    <w:p>
+      <w:pPr>
+        <w:pStyle w:val="BodyText"/>
+        <w:spacing w:line="276" w:lineRule="auto"/>
+        <w:rPr>
+          <w:lang w:val="en-GB"/>
+        </w:rPr>
+      </w:pPr>
+      <w:r>
+        <w:rPr>
+          <w:lang w:val="en-GB"/>
+        </w:rPr>
+        <w:t>Acts as the entry point for all client requests. It handles routing of HTTP requests to the appropriate Lambda functions and manages API endpoints.</w:t>
       </w:r>
     </w:p>
     <w:p>
@@ -2987,51 +2994,11 @@
       <w:pPr>
         <w:pStyle w:val="BodyText"/>
         <w:spacing w:line="276" w:lineRule="auto"/>
-        <w:rPr>
-          <w:lang w:val="en-GB"/>
-        </w:rPr>
-      </w:pPr>
-      <w:r>
         <w:rPr>
           <w:b/>
           <w:bCs/>
           <w:lang w:val="en-GB"/>
         </w:rPr>
-        <w:t>Amazon SQS (Simple Queue Service)</w:t>
-      </w:r>
-    </w:p>
-    <w:p>
-      <w:pPr>
-        <w:pStyle w:val="BodyText"/>
-        <w:spacing w:line="276" w:lineRule="auto"/>
-        <w:rPr>
-          <w:lang w:val="en-GB"/>
-        </w:rPr>
-      </w:pPr>
-      <w:r>
-        <w:rPr>
-          <w:lang w:val="en-GB"/>
-        </w:rPr>
-        <w:t>Serves as a message queue that decouples job submission from job processing. It ensures reliable delivery and enables asynchronous execution.</w:t>
-      </w:r>
-    </w:p>
-    <w:p>
-      <w:pPr>
-        <w:pStyle w:val="BodyText"/>
-        <w:spacing w:line="276" w:lineRule="auto"/>
-        <w:jc w:val="left"/>
-        <w:rPr>
-          <w:lang w:val="en-GB"/>
-        </w:rPr>
-      </w:pPr>
-    </w:p>
-    <w:p>
-      <w:pPr>
-        <w:pStyle w:val="BodyText"/>
-        <w:spacing w:line="276" w:lineRule="auto"/>
-        <w:rPr>
-          <w:lang w:val="en-GB"/>
-        </w:rPr>
       </w:pPr>
       <w:proofErr w:type="spellStart"/>
       <w:r>
@@ -3040,9 +3007,247 @@
           <w:bCs/>
           <w:lang w:val="en-GB"/>
         </w:rPr>
+        <w:t>submitJobLambda</w:t>
+      </w:r>
+      <w:proofErr w:type="spellEnd"/>
+    </w:p>
+    <w:p>
+      <w:pPr>
+        <w:pStyle w:val="BodyText"/>
+        <w:spacing w:line="276" w:lineRule="auto"/>
+        <w:rPr>
+          <w:lang w:val="en-GB"/>
+        </w:rPr>
+      </w:pPr>
+      <w:r>
+        <w:rPr>
+          <w:lang w:val="en-GB"/>
+        </w:rPr>
+        <w:drawing>
+          <wp:inline distT="0" distB="0" distL="0" distR="0" wp14:anchorId="489D042D" wp14:editId="6A090FEA">
+            <wp:extent cx="5731510" cy="3943985"/>
+            <wp:effectExtent l="0" t="0" r="2540" b="0"/>
+            <wp:docPr id="392536708" name="Picture 1"/>
+            <wp:cNvGraphicFramePr>
+              <a:graphicFrameLocks xmlns:a="http://schemas.openxmlformats.org/drawingml/2006/main" noChangeAspect="1"/>
+            </wp:cNvGraphicFramePr>
+            <a:graphic xmlns:a="http://schemas.openxmlformats.org/drawingml/2006/main">
+              <a:graphicData uri="http://schemas.openxmlformats.org/drawingml/2006/picture">
+                <pic:pic xmlns:pic="http://schemas.openxmlformats.org/drawingml/2006/picture">
+                  <pic:nvPicPr>
+                    <pic:cNvPr id="392536708" name=""/>
+                    <pic:cNvPicPr/>
+                  </pic:nvPicPr>
+                  <pic:blipFill>
+                    <a:blip r:embed="rId10"/>
+                    <a:stretch>
+                      <a:fillRect/>
+                    </a:stretch>
+                  </pic:blipFill>
+                  <pic:spPr>
+                    <a:xfrm>
+                      <a:off x="0" y="0"/>
+                      <a:ext cx="5731510" cy="3943985"/>
+                    </a:xfrm>
+                    <a:prstGeom prst="rect">
+                      <a:avLst/>
+                    </a:prstGeom>
+                  </pic:spPr>
+                </pic:pic>
+              </a:graphicData>
+            </a:graphic>
+          </wp:inline>
+        </w:drawing>
+      </w:r>
+    </w:p>
+    <w:p>
+      <w:pPr>
+        <w:pStyle w:val="BodyText"/>
+        <w:spacing w:line="276" w:lineRule="auto"/>
+        <w:rPr>
+          <w:lang w:val="en-GB"/>
+        </w:rPr>
+      </w:pPr>
+      <w:r>
+        <w:rPr>
+          <w:lang w:val="en-GB"/>
+        </w:rPr>
+        <w:t>Responsible for validating incoming job requests, generating job IDs, storing initial job data, and sending messages to the SQS queue.</w:t>
+      </w:r>
+    </w:p>
+    <w:p>
+      <w:pPr>
+        <w:pStyle w:val="BodyText"/>
+        <w:spacing w:line="276" w:lineRule="auto"/>
+        <w:jc w:val="left"/>
+        <w:rPr>
+          <w:lang w:val="en-GB"/>
+        </w:rPr>
+      </w:pPr>
+    </w:p>
+    <w:p>
+      <w:pPr>
+        <w:pStyle w:val="BodyText"/>
+        <w:spacing w:line="276" w:lineRule="auto"/>
+        <w:rPr>
+          <w:b/>
+          <w:bCs/>
+          <w:lang w:val="en-GB"/>
+        </w:rPr>
+      </w:pPr>
+      <w:r>
+        <w:rPr>
+          <w:b/>
+          <w:bCs/>
+          <w:lang w:val="en-GB"/>
+        </w:rPr>
+        <w:t>Amazon SQS</w:t>
+      </w:r>
+    </w:p>
+    <w:p>
+      <w:pPr>
+        <w:pStyle w:val="BodyText"/>
+        <w:spacing w:line="276" w:lineRule="auto"/>
+        <w:rPr>
+          <w:lang w:val="en-GB"/>
+        </w:rPr>
+      </w:pPr>
+      <w:r>
+        <w:rPr>
+          <w:lang w:val="en-GB"/>
+        </w:rPr>
+        <w:lastRenderedPageBreak/>
+        <w:drawing>
+          <wp:inline distT="0" distB="0" distL="0" distR="0" wp14:anchorId="6CC21907" wp14:editId="01CB81C4">
+            <wp:extent cx="5731510" cy="2105025"/>
+            <wp:effectExtent l="0" t="0" r="2540" b="9525"/>
+            <wp:docPr id="1681854162" name="Picture 1"/>
+            <wp:cNvGraphicFramePr>
+              <a:graphicFrameLocks xmlns:a="http://schemas.openxmlformats.org/drawingml/2006/main" noChangeAspect="1"/>
+            </wp:cNvGraphicFramePr>
+            <a:graphic xmlns:a="http://schemas.openxmlformats.org/drawingml/2006/main">
+              <a:graphicData uri="http://schemas.openxmlformats.org/drawingml/2006/picture">
+                <pic:pic xmlns:pic="http://schemas.openxmlformats.org/drawingml/2006/picture">
+                  <pic:nvPicPr>
+                    <pic:cNvPr id="1681854162" name=""/>
+                    <pic:cNvPicPr/>
+                  </pic:nvPicPr>
+                  <pic:blipFill>
+                    <a:blip r:embed="rId11"/>
+                    <a:stretch>
+                      <a:fillRect/>
+                    </a:stretch>
+                  </pic:blipFill>
+                  <pic:spPr>
+                    <a:xfrm>
+                      <a:off x="0" y="0"/>
+                      <a:ext cx="5731510" cy="2105025"/>
+                    </a:xfrm>
+                    <a:prstGeom prst="rect">
+                      <a:avLst/>
+                    </a:prstGeom>
+                  </pic:spPr>
+                </pic:pic>
+              </a:graphicData>
+            </a:graphic>
+          </wp:inline>
+        </w:drawing>
+      </w:r>
+    </w:p>
+    <w:p>
+      <w:pPr>
+        <w:pStyle w:val="BodyText"/>
+        <w:spacing w:line="276" w:lineRule="auto"/>
+        <w:rPr>
+          <w:lang w:val="en-GB"/>
+        </w:rPr>
+      </w:pPr>
+      <w:r>
+        <w:rPr>
+          <w:lang w:val="en-GB"/>
+        </w:rPr>
+        <w:t>Serves as a message queue that decouples job submission from job processing. It ensures reliable delivery and enables asynchronous execution.</w:t>
+      </w:r>
+    </w:p>
+    <w:p>
+      <w:pPr>
+        <w:pStyle w:val="BodyText"/>
+        <w:spacing w:line="276" w:lineRule="auto"/>
+        <w:jc w:val="left"/>
+        <w:rPr>
+          <w:lang w:val="en-GB"/>
+        </w:rPr>
+      </w:pPr>
+    </w:p>
+    <w:p>
+      <w:pPr>
+        <w:pStyle w:val="BodyText"/>
+        <w:spacing w:line="276" w:lineRule="auto"/>
+        <w:rPr>
+          <w:b/>
+          <w:bCs/>
+          <w:lang w:val="en-GB"/>
+        </w:rPr>
+      </w:pPr>
+      <w:proofErr w:type="spellStart"/>
+      <w:r>
+        <w:rPr>
+          <w:b/>
+          <w:bCs/>
+          <w:lang w:val="en-GB"/>
+        </w:rPr>
         <w:t>workerLambda</w:t>
       </w:r>
       <w:proofErr w:type="spellEnd"/>
+    </w:p>
+    <w:p>
+      <w:pPr>
+        <w:pStyle w:val="BodyText"/>
+        <w:spacing w:line="276" w:lineRule="auto"/>
+        <w:rPr>
+          <w:lang w:val="en-GB"/>
+        </w:rPr>
+      </w:pPr>
+      <w:r>
+        <w:rPr>
+          <w:lang w:val="en-GB"/>
+        </w:rPr>
+        <w:drawing>
+          <wp:inline distT="0" distB="0" distL="0" distR="0" wp14:anchorId="7D9D7790" wp14:editId="6EABBAFD">
+            <wp:extent cx="5731510" cy="3870325"/>
+            <wp:effectExtent l="0" t="0" r="2540" b="0"/>
+            <wp:docPr id="1780141933" name="Picture 1"/>
+            <wp:cNvGraphicFramePr>
+              <a:graphicFrameLocks xmlns:a="http://schemas.openxmlformats.org/drawingml/2006/main" noChangeAspect="1"/>
+            </wp:cNvGraphicFramePr>
+            <a:graphic xmlns:a="http://schemas.openxmlformats.org/drawingml/2006/main">
+              <a:graphicData uri="http://schemas.openxmlformats.org/drawingml/2006/picture">
+                <pic:pic xmlns:pic="http://schemas.openxmlformats.org/drawingml/2006/picture">
+                  <pic:nvPicPr>
+                    <pic:cNvPr id="1780141933" name=""/>
+                    <pic:cNvPicPr/>
+                  </pic:nvPicPr>
+                  <pic:blipFill>
+                    <a:blip r:embed="rId12"/>
+                    <a:stretch>
+                      <a:fillRect/>
+                    </a:stretch>
+                  </pic:blipFill>
+                  <pic:spPr>
+                    <a:xfrm>
+                      <a:off x="0" y="0"/>
+                      <a:ext cx="5731510" cy="3870325"/>
+                    </a:xfrm>
+                    <a:prstGeom prst="rect">
+                      <a:avLst/>
+                    </a:prstGeom>
+                  </pic:spPr>
+                </pic:pic>
+              </a:graphicData>
+            </a:graphic>
+          </wp:inline>
+        </w:drawing>
+      </w:r>
       <w:r>
         <w:rPr>
           <w:lang w:val="en-GB"/>
@@ -3066,19 +3271,71 @@
         <w:pStyle w:val="BodyText"/>
         <w:spacing w:line="276" w:lineRule="auto"/>
         <w:rPr>
-          <w:lang w:val="en-GB"/>
-        </w:rPr>
-      </w:pPr>
-      <w:proofErr w:type="spellStart"/>
-      <w:r>
-        <w:rPr>
           <w:b/>
           <w:bCs/>
           <w:lang w:val="en-GB"/>
         </w:rPr>
+      </w:pPr>
+      <w:proofErr w:type="spellStart"/>
+      <w:r>
+        <w:rPr>
+          <w:b/>
+          <w:bCs/>
+          <w:lang w:val="en-GB"/>
+        </w:rPr>
         <w:t>getJobLambda</w:t>
       </w:r>
       <w:proofErr w:type="spellEnd"/>
+    </w:p>
+    <w:p>
+      <w:pPr>
+        <w:pStyle w:val="BodyText"/>
+        <w:spacing w:line="276" w:lineRule="auto"/>
+        <w:rPr>
+          <w:lang w:val="en-GB"/>
+        </w:rPr>
+      </w:pPr>
+      <w:r>
+        <w:rPr>
+          <w:lang w:val="en-GB"/>
+        </w:rPr>
+        <w:lastRenderedPageBreak/>
+        <w:drawing>
+          <wp:inline distT="0" distB="0" distL="0" distR="0" wp14:anchorId="308D9B40" wp14:editId="63F29315">
+            <wp:extent cx="5731510" cy="3562350"/>
+            <wp:effectExtent l="0" t="0" r="2540" b="0"/>
+            <wp:docPr id="1296345386" name="Picture 1"/>
+            <wp:cNvGraphicFramePr>
+              <a:graphicFrameLocks xmlns:a="http://schemas.openxmlformats.org/drawingml/2006/main" noChangeAspect="1"/>
+            </wp:cNvGraphicFramePr>
+            <a:graphic xmlns:a="http://schemas.openxmlformats.org/drawingml/2006/main">
+              <a:graphicData uri="http://schemas.openxmlformats.org/drawingml/2006/picture">
+                <pic:pic xmlns:pic="http://schemas.openxmlformats.org/drawingml/2006/picture">
+                  <pic:nvPicPr>
+                    <pic:cNvPr id="1296345386" name=""/>
+                    <pic:cNvPicPr/>
+                  </pic:nvPicPr>
+                  <pic:blipFill>
+                    <a:blip r:embed="rId13"/>
+                    <a:stretch>
+                      <a:fillRect/>
+                    </a:stretch>
+                  </pic:blipFill>
+                  <pic:spPr>
+                    <a:xfrm>
+                      <a:off x="0" y="0"/>
+                      <a:ext cx="5731510" cy="3562350"/>
+                    </a:xfrm>
+                    <a:prstGeom prst="rect">
+                      <a:avLst/>
+                    </a:prstGeom>
+                  </pic:spPr>
+                </pic:pic>
+              </a:graphicData>
+            </a:graphic>
+          </wp:inline>
+        </w:drawing>
+      </w:r>
       <w:r>
         <w:rPr>
           <w:lang w:val="en-GB"/>
@@ -3104,50 +3361,10 @@
         <w:pStyle w:val="BodyText"/>
         <w:spacing w:line="276" w:lineRule="auto"/>
         <w:rPr>
-          <w:lang w:val="en-GB"/>
-        </w:rPr>
-      </w:pPr>
-      <w:r>
-        <w:rPr>
           <w:b/>
           <w:bCs/>
           <w:lang w:val="en-GB"/>
         </w:rPr>
-        <w:t>Amazon DynamoDB</w:t>
-      </w:r>
-    </w:p>
-    <w:p>
-      <w:pPr>
-        <w:pStyle w:val="BodyText"/>
-        <w:spacing w:line="276" w:lineRule="auto"/>
-        <w:rPr>
-          <w:lang w:val="en-GB"/>
-        </w:rPr>
-      </w:pPr>
-      <w:r>
-        <w:rPr>
-          <w:lang w:val="en-GB"/>
-        </w:rPr>
-        <w:t>A NoSQL database used to store job metadata, status, and execution results. It provides low-latency access and scalability.</w:t>
-      </w:r>
-    </w:p>
-    <w:p>
-      <w:pPr>
-        <w:pStyle w:val="BodyText"/>
-        <w:spacing w:line="276" w:lineRule="auto"/>
-        <w:jc w:val="left"/>
-        <w:rPr>
-          <w:lang w:val="en-GB"/>
-        </w:rPr>
-      </w:pPr>
-    </w:p>
-    <w:p>
-      <w:pPr>
-        <w:pStyle w:val="BodyText"/>
-        <w:spacing w:line="276" w:lineRule="auto"/>
-        <w:rPr>
-          <w:lang w:val="en-GB"/>
-        </w:rPr>
       </w:pPr>
       <w:r>
         <w:rPr>
@@ -3155,7 +3372,150 @@
           <w:bCs/>
           <w:lang w:val="en-GB"/>
         </w:rPr>
+        <w:t>Amazon DynamoDB</w:t>
+      </w:r>
+    </w:p>
+    <w:p>
+      <w:pPr>
+        <w:pStyle w:val="BodyText"/>
+        <w:spacing w:line="276" w:lineRule="auto"/>
+        <w:rPr>
+          <w:lang w:val="en-GB"/>
+        </w:rPr>
+      </w:pPr>
+      <w:r>
+        <w:rPr>
+          <w:lang w:val="en-GB"/>
+        </w:rPr>
+        <w:drawing>
+          <wp:inline distT="0" distB="0" distL="0" distR="0" wp14:anchorId="113991E9" wp14:editId="1C0E4CDD">
+            <wp:extent cx="5731510" cy="2349500"/>
+            <wp:effectExtent l="0" t="0" r="2540" b="0"/>
+            <wp:docPr id="1953034791" name="Picture 1"/>
+            <wp:cNvGraphicFramePr>
+              <a:graphicFrameLocks xmlns:a="http://schemas.openxmlformats.org/drawingml/2006/main" noChangeAspect="1"/>
+            </wp:cNvGraphicFramePr>
+            <a:graphic xmlns:a="http://schemas.openxmlformats.org/drawingml/2006/main">
+              <a:graphicData uri="http://schemas.openxmlformats.org/drawingml/2006/picture">
+                <pic:pic xmlns:pic="http://schemas.openxmlformats.org/drawingml/2006/picture">
+                  <pic:nvPicPr>
+                    <pic:cNvPr id="1953034791" name=""/>
+                    <pic:cNvPicPr/>
+                  </pic:nvPicPr>
+                  <pic:blipFill>
+                    <a:blip r:embed="rId14"/>
+                    <a:stretch>
+                      <a:fillRect/>
+                    </a:stretch>
+                  </pic:blipFill>
+                  <pic:spPr>
+                    <a:xfrm>
+                      <a:off x="0" y="0"/>
+                      <a:ext cx="5731510" cy="2349500"/>
+                    </a:xfrm>
+                    <a:prstGeom prst="rect">
+                      <a:avLst/>
+                    </a:prstGeom>
+                  </pic:spPr>
+                </pic:pic>
+              </a:graphicData>
+            </a:graphic>
+          </wp:inline>
+        </w:drawing>
+      </w:r>
+    </w:p>
+    <w:p>
+      <w:pPr>
+        <w:pStyle w:val="BodyText"/>
+        <w:spacing w:line="276" w:lineRule="auto"/>
+        <w:rPr>
+          <w:lang w:val="en-GB"/>
+        </w:rPr>
+      </w:pPr>
+      <w:r>
+        <w:rPr>
+          <w:lang w:val="en-GB"/>
+        </w:rPr>
+        <w:t>A NoSQL database used to store job metadata, status, and execution results. It provides low-latency access and scalability.</w:t>
+      </w:r>
+    </w:p>
+    <w:p>
+      <w:pPr>
+        <w:pStyle w:val="BodyText"/>
+        <w:spacing w:line="276" w:lineRule="auto"/>
+        <w:jc w:val="left"/>
+        <w:rPr>
+          <w:lang w:val="en-GB"/>
+        </w:rPr>
+      </w:pPr>
+    </w:p>
+    <w:p>
+      <w:pPr>
+        <w:pStyle w:val="BodyText"/>
+        <w:spacing w:line="276" w:lineRule="auto"/>
+        <w:rPr>
+          <w:b/>
+          <w:bCs/>
+          <w:lang w:val="en-GB"/>
+        </w:rPr>
+      </w:pPr>
+      <w:r>
+        <w:rPr>
+          <w:b/>
+          <w:bCs/>
+          <w:lang w:val="en-GB"/>
+        </w:rPr>
         <w:t>Amazon CloudWatch</w:t>
+      </w:r>
+    </w:p>
+    <w:p>
+      <w:pPr>
+        <w:pStyle w:val="BodyText"/>
+        <w:spacing w:line="276" w:lineRule="auto"/>
+        <w:rPr>
+          <w:lang w:val="en-GB"/>
+        </w:rPr>
+      </w:pPr>
+      <w:r>
+        <w:rPr>
+          <w:lang w:val="en-GB"/>
+        </w:rPr>
+        <w:lastRenderedPageBreak/>
+        <w:drawing>
+          <wp:inline distT="0" distB="0" distL="0" distR="0" wp14:anchorId="746D15A5" wp14:editId="50545024">
+            <wp:extent cx="5731510" cy="2302510"/>
+            <wp:effectExtent l="0" t="0" r="2540" b="2540"/>
+            <wp:docPr id="182049016" name="Picture 1"/>
+            <wp:cNvGraphicFramePr>
+              <a:graphicFrameLocks xmlns:a="http://schemas.openxmlformats.org/drawingml/2006/main" noChangeAspect="1"/>
+            </wp:cNvGraphicFramePr>
+            <a:graphic xmlns:a="http://schemas.openxmlformats.org/drawingml/2006/main">
+              <a:graphicData uri="http://schemas.openxmlformats.org/drawingml/2006/picture">
+                <pic:pic xmlns:pic="http://schemas.openxmlformats.org/drawingml/2006/picture">
+                  <pic:nvPicPr>
+                    <pic:cNvPr id="182049016" name=""/>
+                    <pic:cNvPicPr/>
+                  </pic:nvPicPr>
+                  <pic:blipFill>
+                    <a:blip r:embed="rId15"/>
+                    <a:stretch>
+                      <a:fillRect/>
+                    </a:stretch>
+                  </pic:blipFill>
+                  <pic:spPr>
+                    <a:xfrm>
+                      <a:off x="0" y="0"/>
+                      <a:ext cx="5731510" cy="2302510"/>
+                    </a:xfrm>
+                    <a:prstGeom prst="rect">
+                      <a:avLst/>
+                    </a:prstGeom>
+                  </pic:spPr>
+                </pic:pic>
+              </a:graphicData>
+            </a:graphic>
+          </wp:inline>
+        </w:drawing>
       </w:r>
     </w:p>
     <w:p>
@@ -3429,7 +3789,6 @@
         <w:rPr>
           <w:lang w:val="en-GB"/>
         </w:rPr>
-        <w:lastRenderedPageBreak/>
         <w:t xml:space="preserve">The </w:t>
       </w:r>
       <w:proofErr w:type="spellStart"/>
@@ -3745,6 +4104,7 @@
           <w:bCs/>
           <w:lang w:val="en-GB"/>
         </w:rPr>
+        <w:lastRenderedPageBreak/>
         <w:t>Application Load Balancer</w:t>
       </w:r>
       <w:r>
@@ -4094,19 +4454,7 @@
         <w:rPr>
           <w:lang w:val="en-GB"/>
         </w:rPr>
-        <w:t xml:space="preserve">The system is designed to be scalable by leveraging serverless and managed cloud services. On the backend, scalability is primarily achieved </w:t>
-      </w:r>
-      <w:r>
-        <w:rPr>
-          <w:lang w:val="en-GB"/>
-        </w:rPr>
-        <w:t>using</w:t>
-      </w:r>
-      <w:r>
-        <w:rPr>
-          <w:lang w:val="en-GB"/>
-        </w:rPr>
-        <w:t xml:space="preserve"> AWS Lambda and Amazon SQS.</w:t>
+        <w:t>The system is designed to be scalable by leveraging serverless and managed cloud services. On the backend, scalability is primarily achieved using AWS Lambda and Amazon SQS.</w:t>
       </w:r>
     </w:p>
     <w:p>
@@ -4154,19 +4502,7 @@
         <w:rPr>
           <w:lang w:val="en-GB"/>
         </w:rPr>
-        <w:t xml:space="preserve">It is important to note that Lambda functions operate as isolated execution environments rather than traditional threads. This means that multiple worker instances can run independently in parallel, allowing the system to process several jobs at the same time. As a result, the architecture </w:t>
-      </w:r>
-      <w:r>
-        <w:rPr>
-          <w:lang w:val="en-GB"/>
-        </w:rPr>
-        <w:t>can</w:t>
-      </w:r>
-      <w:r>
-        <w:rPr>
-          <w:lang w:val="en-GB"/>
-        </w:rPr>
-        <w:t xml:space="preserve"> accommodate fluctuating workloads without requiring manual provisioning or infrastructure management.</w:t>
+        <w:t>It is important to note that Lambda functions operate as isolated execution environments rather than traditional threads. This means that multiple worker instances can run independently in parallel, allowing the system to process several jobs at the same time. As a result, the architecture can accommodate fluctuating workloads without requiring manual provisioning or infrastructure management.</w:t>
       </w:r>
     </w:p>
     <w:p>
@@ -4255,55 +4591,31 @@
         <w:rPr>
           <w:lang w:val="en-GB"/>
         </w:rPr>
-        <w:t xml:space="preserve">Reliability is achieved </w:t>
-      </w:r>
-      <w:r>
-        <w:rPr>
-          <w:lang w:val="en-GB"/>
-        </w:rPr>
-        <w:t>using</w:t>
-      </w:r>
-      <w:r>
-        <w:rPr>
-          <w:lang w:val="en-GB"/>
-        </w:rPr>
-        <w:t xml:space="preserve"> managed AWS services and an asynchronous processing model. Amazon SQS plays a central role by providing durable message storage between job submission and job execution. This ensures that submitted jobs are not tightly coupled to immediate worker availability and can remain safely queued until processing occurs.</w:t>
-      </w:r>
-    </w:p>
-    <w:p>
-      <w:pPr>
-        <w:pStyle w:val="BodyText"/>
-        <w:spacing w:line="276" w:lineRule="auto"/>
-        <w:rPr>
-          <w:lang w:val="en-GB"/>
-        </w:rPr>
-      </w:pPr>
-    </w:p>
-    <w:p>
-      <w:pPr>
-        <w:pStyle w:val="BodyText"/>
-        <w:spacing w:line="276" w:lineRule="auto"/>
-        <w:rPr>
-          <w:lang w:val="en-GB"/>
-        </w:rPr>
-      </w:pPr>
-      <w:r>
-        <w:rPr>
-          <w:lang w:val="en-GB"/>
-        </w:rPr>
-        <w:t xml:space="preserve">SQS provides at-least-once delivery semantics, which means that messages may occasionally be delivered more than once. While this introduces the possibility of duplicate processing, it also improves reliability by reducing the risk of job loss in the event of transient failures. The system is therefore designed around a realistic distributed systems model in which retry </w:t>
-      </w:r>
-      <w:r>
-        <w:rPr>
-          <w:lang w:val="en-GB"/>
-        </w:rPr>
-        <w:t>behaviour</w:t>
-      </w:r>
-      <w:r>
-        <w:rPr>
-          <w:lang w:val="en-GB"/>
-        </w:rPr>
-        <w:t xml:space="preserve"> must be tolerated.</w:t>
+        <w:t>Reliability is achieved using managed AWS services and an asynchronous processing model. Amazon SQS plays a central role by providing durable message storage between job submission and job execution. This ensures that submitted jobs are not tightly coupled to immediate worker availability and can remain safely queued until processing occurs.</w:t>
+      </w:r>
+    </w:p>
+    <w:p>
+      <w:pPr>
+        <w:pStyle w:val="BodyText"/>
+        <w:spacing w:line="276" w:lineRule="auto"/>
+        <w:rPr>
+          <w:lang w:val="en-GB"/>
+        </w:rPr>
+      </w:pPr>
+    </w:p>
+    <w:p>
+      <w:pPr>
+        <w:pStyle w:val="BodyText"/>
+        <w:spacing w:line="276" w:lineRule="auto"/>
+        <w:rPr>
+          <w:lang w:val="en-GB"/>
+        </w:rPr>
+      </w:pPr>
+      <w:r>
+        <w:rPr>
+          <w:lang w:val="en-GB"/>
+        </w:rPr>
+        <w:t>SQS provides at-least-once delivery semantics, which means that messages may occasionally be delivered more than once. While this introduces the possibility of duplicate processing, it also improves reliability by reducing the risk of job loss in the event of transient failures. The system is therefore designed around a realistic distributed systems model in which retry behaviour must be tolerated.</w:t>
       </w:r>
     </w:p>
     <w:p>
@@ -6154,7 +6466,7 @@
         </w:rPr>
         <w:t xml:space="preserve">, 2023. [Online]. Available: </w:t>
       </w:r>
-      <w:hyperlink r:id="rId9" w:tgtFrame="_blank" w:history="1">
+      <w:hyperlink r:id="rId16" w:tgtFrame="_blank" w:history="1">
         <w:r>
           <w:rPr>
             <w:rStyle w:val="Hyperlink"/>
@@ -6455,12 +6767,12 @@
       </w:r>
     </w:p>
     <w:sectPr>
-      <w:headerReference w:type="even" r:id="rId10"/>
-      <w:headerReference w:type="default" r:id="rId11"/>
-      <w:footerReference w:type="even" r:id="rId12"/>
-      <w:footerReference w:type="default" r:id="rId13"/>
-      <w:headerReference w:type="first" r:id="rId14"/>
-      <w:footerReference w:type="first" r:id="rId15"/>
+      <w:headerReference w:type="even" r:id="rId17"/>
+      <w:headerReference w:type="default" r:id="rId18"/>
+      <w:footerReference w:type="even" r:id="rId19"/>
+      <w:footerReference w:type="default" r:id="rId20"/>
+      <w:headerReference w:type="first" r:id="rId21"/>
+      <w:footerReference w:type="first" r:id="rId22"/>
       <w:pgSz w:w="11906" w:h="16838"/>
       <w:pgMar w:top="1560" w:right="1440" w:bottom="1560" w:left="1440" w:header="708" w:footer="708" w:gutter="0"/>
       <w:pgNumType w:start="1"/>
@@ -6643,7 +6955,7 @@
         <w:noProof/>
         <w:sz w:val="16"/>
       </w:rPr>
-      <w:t>14</w:t>
+      <w:t>17</w:t>
     </w:r>
     <w:r>
       <w:rPr>
@@ -8066,6 +8378,7 @@
   <w:style w:type="character" w:default="1" w:styleId="DefaultParagraphFont">
     <w:name w:val="Default Paragraph Font"/>
     <w:uiPriority w:val="1"/>
+    <w:semiHidden/>
     <w:unhideWhenUsed/>
   </w:style>
   <w:style w:type="table" w:default="1" w:styleId="TableNormal">

</xml_diff>